<commit_message>
update fetch resample + geospatial clustering
</commit_message>
<xml_diff>
--- a/Notes/Datasets(Primary +Secondary).docx
+++ b/Notes/Datasets(Primary +Secondary).docx
@@ -119,15 +119,7 @@
           </w:tcPr>
           <w:p>
             <w:r>
-              <w:t xml:space="preserve">Elevation, slope, aspect, </w:t>
-            </w:r>
-            <w:proofErr w:type="spellStart"/>
-            <w:r>
-              <w:t>s.d.</w:t>
-            </w:r>
-            <w:proofErr w:type="spellEnd"/>
-            <w:r>
-              <w:t xml:space="preserve"> elevation, surface roughness</w:t>
+              <w:t>Elevation, slope, aspect, s.d. elevation, surface roughness</w:t>
             </w:r>
           </w:p>
         </w:tc>
@@ -165,7 +157,11 @@
           <w:tcPr>
             <w:tcW w:w="1876" w:type="dxa"/>
           </w:tcPr>
-          <w:p/>
+          <w:p>
+            <w:r>
+              <w:t>done</w:t>
+            </w:r>
+          </w:p>
         </w:tc>
       </w:tr>
       <w:tr>
@@ -226,7 +222,11 @@
           <w:tcPr>
             <w:tcW w:w="1876" w:type="dxa"/>
           </w:tcPr>
-          <w:p/>
+          <w:p>
+            <w:r>
+              <w:t>done</w:t>
+            </w:r>
+          </w:p>
         </w:tc>
       </w:tr>
       <w:tr>
@@ -466,13 +466,8 @@
             <w:tcW w:w="2210" w:type="dxa"/>
           </w:tcPr>
           <w:p>
-            <w:proofErr w:type="spellStart"/>
-            <w:r>
-              <w:t>Insitu</w:t>
-            </w:r>
-            <w:proofErr w:type="spellEnd"/>
-            <w:r>
-              <w:t xml:space="preserve"> data</w:t>
+            <w:r>
+              <w:t>Insitu data</w:t>
             </w:r>
           </w:p>
         </w:tc>
@@ -500,7 +495,11 @@
           <w:tcPr>
             <w:tcW w:w="1876" w:type="dxa"/>
           </w:tcPr>
-          <w:p/>
+          <w:p>
+            <w:r>
+              <w:t>ongoing</w:t>
+            </w:r>
+          </w:p>
         </w:tc>
       </w:tr>
       <w:tr>
@@ -522,13 +521,8 @@
             <w:tcW w:w="3902" w:type="dxa"/>
           </w:tcPr>
           <w:p>
-            <w:proofErr w:type="spellStart"/>
-            <w:r>
-              <w:t>Köppen</w:t>
-            </w:r>
-            <w:proofErr w:type="spellEnd"/>
-            <w:r>
-              <w:t>-Geiger</w:t>
+            <w:r>
+              <w:t>Köppen-Geiger</w:t>
             </w:r>
             <w:r>
               <w:t xml:space="preserve"> class</w:t>
@@ -1639,55 +1633,7 @@
                 <w:szCs w:val="21"/>
                 <w14:ligatures w14:val="none"/>
               </w:rPr>
-              <w:t>. Accuracy limited by sparse observations over high altitudes; reported as non-suitable for elevations $&gt;5000\</w:t>
-            </w:r>
-            <w:proofErr w:type="gramStart"/>
-            <w:r>
-              <w:rPr>
-                <w:rFonts w:ascii="Arial" w:eastAsia="Times New Roman" w:hAnsi="Arial" w:cs="Arial"/>
-                <w:color w:val="131314"/>
-                <w:kern w:val="0"/>
-                <w:sz w:val="21"/>
-                <w:szCs w:val="21"/>
-                <w14:ligatures w14:val="none"/>
-              </w:rPr>
-              <w:t>text{ m</w:t>
-            </w:r>
-            <w:proofErr w:type="gramEnd"/>
-            <w:r>
-              <w:rPr>
-                <w:rFonts w:ascii="Arial" w:eastAsia="Times New Roman" w:hAnsi="Arial" w:cs="Arial"/>
-                <w:color w:val="131314"/>
-                <w:kern w:val="0"/>
-                <w:sz w:val="21"/>
-                <w:szCs w:val="21"/>
-                <w14:ligatures w14:val="none"/>
-              </w:rPr>
-              <w:t xml:space="preserve">}$ </w:t>
-            </w:r>
-            <w:proofErr w:type="spellStart"/>
-            <w:r>
-              <w:rPr>
-                <w:rFonts w:ascii="Arial" w:eastAsia="Times New Roman" w:hAnsi="Arial" w:cs="Arial"/>
-                <w:color w:val="131314"/>
-                <w:kern w:val="0"/>
-                <w:sz w:val="21"/>
-                <w:szCs w:val="21"/>
-                <w14:ligatures w14:val="none"/>
-              </w:rPr>
-              <w:t>amsl</w:t>
-            </w:r>
-            <w:proofErr w:type="spellEnd"/>
-            <w:r>
-              <w:rPr>
-                <w:rFonts w:ascii="Arial" w:eastAsia="Times New Roman" w:hAnsi="Arial" w:cs="Arial"/>
-                <w:color w:val="131314"/>
-                <w:kern w:val="0"/>
-                <w:sz w:val="21"/>
-                <w:szCs w:val="21"/>
-                <w14:ligatures w14:val="none"/>
-              </w:rPr>
-              <w:t>.</w:t>
+              <w:t>. Accuracy limited by sparse observations over high altitudes; reported as non-suitable for elevations $&gt;5000\text{ m}$ amsl.</w:t>
             </w:r>
           </w:p>
         </w:tc>
@@ -3745,31 +3691,7 @@
                 <w:szCs w:val="21"/>
                 <w14:ligatures w14:val="none"/>
               </w:rPr>
-              <w:t xml:space="preserve">. </w:t>
-            </w:r>
-            <w:proofErr w:type="gramStart"/>
-            <w:r>
-              <w:rPr>
-                <w:rFonts w:ascii="Arial" w:eastAsia="Times New Roman" w:hAnsi="Arial" w:cs="Arial"/>
-                <w:color w:val="131314"/>
-                <w:kern w:val="0"/>
-                <w:sz w:val="21"/>
-                <w:szCs w:val="21"/>
-                <w14:ligatures w14:val="none"/>
-              </w:rPr>
-              <w:t>Generally</w:t>
-            </w:r>
-            <w:proofErr w:type="gramEnd"/>
-            <w:r>
-              <w:rPr>
-                <w:rFonts w:ascii="Arial" w:eastAsia="Times New Roman" w:hAnsi="Arial" w:cs="Arial"/>
-                <w:color w:val="131314"/>
-                <w:kern w:val="0"/>
-                <w:sz w:val="21"/>
-                <w:szCs w:val="21"/>
-                <w14:ligatures w14:val="none"/>
-              </w:rPr>
-              <w:t xml:space="preserve"> underperforms in high-elevation areas due to coarse resolution, exhibiting a "too gentle spatial characteristic" in mountainous Nepal.</w:t>
+              <w:t>. Generally underperforms in high-elevation areas due to coarse resolution, exhibiting a "too gentle spatial characteristic" in mountainous Nepal.</w:t>
             </w:r>
           </w:p>
         </w:tc>
@@ -4044,55 +3966,7 @@
                 <w:szCs w:val="21"/>
                 <w14:ligatures w14:val="none"/>
               </w:rPr>
-              <w:t xml:space="preserve">. Better resolution led to better performance than ERA-Interim in high-elevation areas of </w:t>
-            </w:r>
-            <w:proofErr w:type="gramStart"/>
-            <w:r>
-              <w:rPr>
-                <w:rFonts w:ascii="Arial" w:eastAsia="Times New Roman" w:hAnsi="Arial" w:cs="Arial"/>
-                <w:color w:val="131314"/>
-                <w:kern w:val="0"/>
-                <w:sz w:val="21"/>
-                <w:szCs w:val="21"/>
-                <w14:ligatures w14:val="none"/>
-              </w:rPr>
-              <w:t>Nepal, but</w:t>
-            </w:r>
-            <w:proofErr w:type="gramEnd"/>
-            <w:r>
-              <w:rPr>
-                <w:rFonts w:ascii="Arial" w:eastAsia="Times New Roman" w:hAnsi="Arial" w:cs="Arial"/>
-                <w:color w:val="131314"/>
-                <w:kern w:val="0"/>
-                <w:sz w:val="21"/>
-                <w:szCs w:val="21"/>
-                <w14:ligatures w14:val="none"/>
-              </w:rPr>
-              <w:t xml:space="preserve"> showed lower performance than IMERG/GPM in high-altitude zones of the </w:t>
-            </w:r>
-            <w:proofErr w:type="spellStart"/>
-            <w:r>
-              <w:rPr>
-                <w:rFonts w:ascii="Arial" w:eastAsia="Times New Roman" w:hAnsi="Arial" w:cs="Arial"/>
-                <w:color w:val="131314"/>
-                <w:kern w:val="0"/>
-                <w:sz w:val="21"/>
-                <w:szCs w:val="21"/>
-                <w14:ligatures w14:val="none"/>
-              </w:rPr>
-              <w:t>Bouregreg</w:t>
-            </w:r>
-            <w:proofErr w:type="spellEnd"/>
-            <w:r>
-              <w:rPr>
-                <w:rFonts w:ascii="Arial" w:eastAsia="Times New Roman" w:hAnsi="Arial" w:cs="Arial"/>
-                <w:color w:val="131314"/>
-                <w:kern w:val="0"/>
-                <w:sz w:val="21"/>
-                <w:szCs w:val="21"/>
-                <w14:ligatures w14:val="none"/>
-              </w:rPr>
-              <w:t xml:space="preserve"> watershed (Morocco).</w:t>
+              <w:t>. Better resolution led to better performance than ERA-Interim in high-elevation areas of Nepal, but showed lower performance than IMERG/GPM in high-altitude zones of the Bouregreg watershed (Morocco).</w:t>
             </w:r>
           </w:p>
         </w:tc>
@@ -5248,31 +5122,7 @@
                 <w:szCs w:val="21"/>
                 <w14:ligatures w14:val="none"/>
               </w:rPr>
-              <w:t>Monthly/5-</w:t>
-            </w:r>
-            <w:proofErr w:type="gramStart"/>
-            <w:r>
-              <w:rPr>
-                <w:rFonts w:ascii="Arial" w:eastAsia="Times New Roman" w:hAnsi="Arial" w:cs="Arial"/>
-                <w:color w:val="131314"/>
-                <w:kern w:val="0"/>
-                <w:sz w:val="21"/>
-                <w:szCs w:val="21"/>
-                <w14:ligatures w14:val="none"/>
-              </w:rPr>
-              <w:t>daily</w:t>
-            </w:r>
-            <w:proofErr w:type="gramEnd"/>
-            <w:r>
-              <w:rPr>
-                <w:rFonts w:ascii="Arial" w:eastAsia="Times New Roman" w:hAnsi="Arial" w:cs="Arial"/>
-                <w:color w:val="131314"/>
-                <w:kern w:val="0"/>
-                <w:sz w:val="21"/>
-                <w:szCs w:val="21"/>
-                <w14:ligatures w14:val="none"/>
-              </w:rPr>
-              <w:t xml:space="preserve"> (PEN)</w:t>
+              <w:t>Monthly/5-daily (PEN)</w:t>
             </w:r>
           </w:p>
         </w:tc>
@@ -5407,7 +5257,6 @@
                 <w14:ligatures w14:val="none"/>
               </w:rPr>
             </w:pPr>
-            <w:proofErr w:type="spellStart"/>
             <w:r>
               <w:rPr>
                 <w:rFonts w:ascii="Arial" w:eastAsia="Times New Roman" w:hAnsi="Arial" w:cs="Arial"/>
@@ -5422,7 +5271,6 @@
               </w:rPr>
               <w:t>GSMaP</w:t>
             </w:r>
-            <w:proofErr w:type="spellEnd"/>
             <w:r>
               <w:rPr>
                 <w:rFonts w:ascii="Arial" w:eastAsia="Times New Roman" w:hAnsi="Arial" w:cs="Arial"/>
@@ -6331,31 +6179,7 @@
                 <w:szCs w:val="21"/>
                 <w14:ligatures w14:val="none"/>
               </w:rPr>
-              <w:t xml:space="preserve">. Extremely coarse </w:t>
-            </w:r>
-            <w:proofErr w:type="gramStart"/>
-            <w:r>
-              <w:rPr>
-                <w:rFonts w:ascii="Arial" w:eastAsia="Times New Roman" w:hAnsi="Arial" w:cs="Arial"/>
-                <w:color w:val="131314"/>
-                <w:kern w:val="0"/>
-                <w:sz w:val="21"/>
-                <w:szCs w:val="21"/>
-                <w14:ligatures w14:val="none"/>
-              </w:rPr>
-              <w:t>resolution;</w:t>
-            </w:r>
-            <w:proofErr w:type="gramEnd"/>
-            <w:r>
-              <w:rPr>
-                <w:rFonts w:ascii="Arial" w:eastAsia="Times New Roman" w:hAnsi="Arial" w:cs="Arial"/>
-                <w:color w:val="131314"/>
-                <w:kern w:val="0"/>
-                <w:sz w:val="21"/>
-                <w:szCs w:val="21"/>
-                <w14:ligatures w14:val="none"/>
-              </w:rPr>
-              <w:t xml:space="preserve"> data quality noted as low in a low-altitude evaluation. Not evaluated in complex high-altitude regions in these sources.</w:t>
+              <w:t>. Extremely coarse resolution; data quality noted as low in a low-altitude evaluation. Not evaluated in complex high-altitude regions in these sources.</w:t>
             </w:r>
           </w:p>
         </w:tc>
@@ -6650,31 +6474,7 @@
                 <w:szCs w:val="21"/>
                 <w14:ligatures w14:val="none"/>
               </w:rPr>
-              <w:t xml:space="preserve">. Evaluated extensively in the Nepalese Himalaya (including up to 5,050 m </w:t>
-            </w:r>
-            <w:proofErr w:type="gramStart"/>
-            <w:r>
-              <w:rPr>
-                <w:rFonts w:ascii="Arial" w:eastAsia="Times New Roman" w:hAnsi="Arial" w:cs="Arial"/>
-                <w:color w:val="131314"/>
-                <w:kern w:val="0"/>
-                <w:sz w:val="21"/>
-                <w:szCs w:val="21"/>
-                <w14:ligatures w14:val="none"/>
-              </w:rPr>
-              <w:t>asl);</w:t>
-            </w:r>
-            <w:proofErr w:type="gramEnd"/>
-            <w:r>
-              <w:rPr>
-                <w:rFonts w:ascii="Arial" w:eastAsia="Times New Roman" w:hAnsi="Arial" w:cs="Arial"/>
-                <w:color w:val="131314"/>
-                <w:kern w:val="0"/>
-                <w:sz w:val="21"/>
-                <w:szCs w:val="21"/>
-                <w14:ligatures w14:val="none"/>
-              </w:rPr>
-              <w:t xml:space="preserve"> showed better performance than TMPA for daily precipitation and drought monitoring.</w:t>
+              <w:t>. Evaluated extensively in the Nepalese Himalaya (including up to 5,050 m asl); showed better performance than TMPA for daily precipitation and drought monitoring.</w:t>
             </w:r>
           </w:p>
         </w:tc>
@@ -7266,7 +7066,6 @@
               </w:rPr>
               <w:t xml:space="preserve">. Used as input for the high-resolution </w:t>
             </w:r>
-            <w:proofErr w:type="spellStart"/>
             <w:r>
               <w:rPr>
                 <w:rFonts w:ascii="Arial" w:eastAsia="Times New Roman" w:hAnsi="Arial" w:cs="Arial"/>
@@ -7277,19 +7076,7 @@
                 <w14:ligatures w14:val="none"/>
               </w:rPr>
               <w:lastRenderedPageBreak/>
-              <w:t>TerraClimate</w:t>
-            </w:r>
-            <w:proofErr w:type="spellEnd"/>
-            <w:r>
-              <w:rPr>
-                <w:rFonts w:ascii="Arial" w:eastAsia="Times New Roman" w:hAnsi="Arial" w:cs="Arial"/>
-                <w:color w:val="131314"/>
-                <w:kern w:val="0"/>
-                <w:sz w:val="21"/>
-                <w:szCs w:val="21"/>
-                <w14:ligatures w14:val="none"/>
-              </w:rPr>
-              <w:t>. Mentioned in comparison over monsoon Asia.</w:t>
+              <w:t>TerraClimate. Mentioned in comparison over monsoon Asia.</w:t>
             </w:r>
           </w:p>
         </w:tc>
@@ -7849,31 +7636,7 @@
                 <w:szCs w:val="21"/>
                 <w14:ligatures w14:val="none"/>
               </w:rPr>
-              <w:t xml:space="preserve">. Found to have the lowest RMSE and bias among reanalysis products with high-altitude gauges in Morocco. Coarse resolution </w:t>
-            </w:r>
-            <w:proofErr w:type="gramStart"/>
-            <w:r>
-              <w:rPr>
-                <w:rFonts w:ascii="Arial" w:eastAsia="Times New Roman" w:hAnsi="Arial" w:cs="Arial"/>
-                <w:color w:val="131314"/>
-                <w:kern w:val="0"/>
-                <w:sz w:val="21"/>
-                <w:szCs w:val="21"/>
-                <w14:ligatures w14:val="none"/>
-              </w:rPr>
-              <w:t>noted</w:t>
-            </w:r>
-            <w:proofErr w:type="gramEnd"/>
-            <w:r>
-              <w:rPr>
-                <w:rFonts w:ascii="Arial" w:eastAsia="Times New Roman" w:hAnsi="Arial" w:cs="Arial"/>
-                <w:color w:val="131314"/>
-                <w:kern w:val="0"/>
-                <w:sz w:val="21"/>
-                <w:szCs w:val="21"/>
-                <w14:ligatures w14:val="none"/>
-              </w:rPr>
-              <w:t xml:space="preserve"> as a restriction for complex terrain.</w:t>
+              <w:t>. Found to have the lowest RMSE and bias among reanalysis products with high-altitude gauges in Morocco. Coarse resolution noted as a restriction for complex terrain.</w:t>
             </w:r>
           </w:p>
         </w:tc>
@@ -8456,55 +8219,7 @@
                 <w:szCs w:val="21"/>
                 <w14:ligatures w14:val="none"/>
               </w:rPr>
-              <w:t xml:space="preserve">. Tested in mountain </w:t>
-            </w:r>
-            <w:proofErr w:type="gramStart"/>
-            <w:r>
-              <w:rPr>
-                <w:rFonts w:ascii="Arial" w:eastAsia="Times New Roman" w:hAnsi="Arial" w:cs="Arial"/>
-                <w:color w:val="131314"/>
-                <w:kern w:val="0"/>
-                <w:sz w:val="21"/>
-                <w:szCs w:val="21"/>
-                <w14:ligatures w14:val="none"/>
-              </w:rPr>
-              <w:t>regions;</w:t>
-            </w:r>
-            <w:proofErr w:type="gramEnd"/>
-            <w:r>
-              <w:rPr>
-                <w:rFonts w:ascii="Arial" w:eastAsia="Times New Roman" w:hAnsi="Arial" w:cs="Arial"/>
-                <w:color w:val="131314"/>
-                <w:kern w:val="0"/>
-                <w:sz w:val="21"/>
-                <w:szCs w:val="21"/>
-                <w14:ligatures w14:val="none"/>
-              </w:rPr>
-              <w:t xml:space="preserve"> showed discrepancies moving from plain to mountain </w:t>
-            </w:r>
-            <w:proofErr w:type="gramStart"/>
-            <w:r>
-              <w:rPr>
-                <w:rFonts w:ascii="Arial" w:eastAsia="Times New Roman" w:hAnsi="Arial" w:cs="Arial"/>
-                <w:color w:val="131314"/>
-                <w:kern w:val="0"/>
-                <w:sz w:val="21"/>
-                <w:szCs w:val="21"/>
-                <w14:ligatures w14:val="none"/>
-              </w:rPr>
-              <w:t>regions, but</w:t>
-            </w:r>
-            <w:proofErr w:type="gramEnd"/>
-            <w:r>
-              <w:rPr>
-                <w:rFonts w:ascii="Arial" w:eastAsia="Times New Roman" w:hAnsi="Arial" w:cs="Arial"/>
-                <w:color w:val="131314"/>
-                <w:kern w:val="0"/>
-                <w:sz w:val="21"/>
-                <w:szCs w:val="21"/>
-                <w14:ligatures w14:val="none"/>
-              </w:rPr>
-              <w:t xml:space="preserve"> often performed better than pure reanalysis products.</w:t>
+              <w:t>. Tested in mountain regions; showed discrepancies moving from plain to mountain regions, but often performed better than pure reanalysis products.</w:t>
             </w:r>
           </w:p>
         </w:tc>
@@ -9396,31 +9111,7 @@
                 <w:szCs w:val="21"/>
                 <w14:ligatures w14:val="none"/>
               </w:rPr>
-              <w:t xml:space="preserve">. Evaluated in high elevation regions (Nepal); showed mixed correlation results at higher stations (2590 </w:t>
-            </w:r>
-            <w:proofErr w:type="spellStart"/>
-            <w:r>
-              <w:rPr>
-                <w:rFonts w:ascii="Arial" w:eastAsia="Times New Roman" w:hAnsi="Arial" w:cs="Arial"/>
-                <w:color w:val="131314"/>
-                <w:kern w:val="0"/>
-                <w:sz w:val="21"/>
-                <w:szCs w:val="21"/>
-                <w14:ligatures w14:val="none"/>
-              </w:rPr>
-              <w:t>masl</w:t>
-            </w:r>
-            <w:proofErr w:type="spellEnd"/>
-            <w:r>
-              <w:rPr>
-                <w:rFonts w:ascii="Arial" w:eastAsia="Times New Roman" w:hAnsi="Arial" w:cs="Arial"/>
-                <w:color w:val="131314"/>
-                <w:kern w:val="0"/>
-                <w:sz w:val="21"/>
-                <w:szCs w:val="21"/>
-                <w14:ligatures w14:val="none"/>
-              </w:rPr>
-              <w:t>).</w:t>
+              <w:t>. Evaluated in high elevation regions (Nepal); showed mixed correlation results at higher stations (2590 masl).</w:t>
             </w:r>
           </w:p>
         </w:tc>
@@ -9479,7 +9170,6 @@
                 <w14:ligatures w14:val="none"/>
               </w:rPr>
             </w:pPr>
-            <w:proofErr w:type="spellStart"/>
             <w:r>
               <w:rPr>
                 <w:rFonts w:ascii="Arial" w:eastAsia="Times New Roman" w:hAnsi="Arial" w:cs="Arial"/>
@@ -9494,7 +9184,6 @@
               </w:rPr>
               <w:t>TerraClimate</w:t>
             </w:r>
-            <w:proofErr w:type="spellEnd"/>
           </w:p>
         </w:tc>
         <w:tc>

</xml_diff>